<commit_message>
chore: remove temporary lock file and update project documentation
</commit_message>
<xml_diff>
--- a/KTPM..docx
+++ b/KTPM..docx
@@ -13797,24 +13797,8 @@
             <w:hideMark/>
           </w:tcPr>
           <w:p>
-            <w:pPr>
-              <w:rPr>
-                <w:rFonts w:eastAsiaTheme="minorHAnsi"/>
-              </w:rPr>
-            </w:pPr>
-            <w:r>
-              <w:rPr>
-                <w:rFonts w:eastAsiaTheme="minorHAnsi"/>
-              </w:rPr>
-              <w:lastRenderedPageBreak/>
-              <w:t xml:space="preserve">Chưa viết test tự </w:t>
-            </w:r>
-            <w:r>
-              <w:rPr>
-                <w:rFonts w:eastAsiaTheme="minorHAnsi"/>
-              </w:rPr>
-              <w:lastRenderedPageBreak/>
-              <w:t>động</w:t>
+            <w:r>
+              <w:t>PASSED</w:t>
             </w:r>
           </w:p>
         </w:tc>
@@ -17235,16 +17219,8 @@
             <w:hideMark/>
           </w:tcPr>
           <w:p>
-            <w:pPr>
-              <w:rPr>
-                <w:rFonts w:eastAsiaTheme="minorHAnsi"/>
-              </w:rPr>
-            </w:pPr>
-            <w:r>
-              <w:rPr>
-                <w:rFonts w:eastAsiaTheme="minorHAnsi"/>
-              </w:rPr>
-              <w:t>1</w:t>
+            <w:r>
+              <w:t>3</w:t>
             </w:r>
           </w:p>
         </w:tc>
@@ -17261,16 +17237,8 @@
             <w:hideMark/>
           </w:tcPr>
           <w:p>
-            <w:pPr>
-              <w:rPr>
-                <w:rFonts w:eastAsiaTheme="minorHAnsi"/>
-              </w:rPr>
-            </w:pPr>
-            <w:r>
-              <w:rPr>
-                <w:rFonts w:eastAsiaTheme="minorHAnsi"/>
-              </w:rPr>
-              <w:t>1</w:t>
+            <w:r>
+              <w:t>3</w:t>
             </w:r>
           </w:p>
         </w:tc>
@@ -17287,15 +17255,7 @@
             <w:hideMark/>
           </w:tcPr>
           <w:p>
-            <w:pPr>
-              <w:rPr>
-                <w:rFonts w:eastAsiaTheme="minorHAnsi"/>
-              </w:rPr>
-            </w:pPr>
-            <w:r>
-              <w:rPr>
-                <w:rFonts w:eastAsiaTheme="minorHAnsi"/>
-              </w:rPr>
+            <w:r>
               <w:t>0</w:t>
             </w:r>
           </w:p>
@@ -17313,15 +17273,7 @@
             <w:hideMark/>
           </w:tcPr>
           <w:p>
-            <w:pPr>
-              <w:rPr>
-                <w:rFonts w:eastAsiaTheme="minorHAnsi"/>
-              </w:rPr>
-            </w:pPr>
-            <w:r>
-              <w:rPr>
-                <w:rFonts w:eastAsiaTheme="minorHAnsi"/>
-              </w:rPr>
+            <w:r>
               <w:t>0</w:t>
             </w:r>
           </w:p>

</xml_diff>